<commit_message>
Implement attendance certificates and notifications
</commit_message>
<xml_diff>
--- a/docs/CampusHub_Team_Feature_Documentation.docx
+++ b/docs/CampusHub_Team_Feature_Documentation.docx
@@ -4346,6 +4346,67 @@
       </w:r>
     </w:p>
     <w:p>
+      <w:r>
+        <w:br w:type="page"/>
+      </w:r>
+    </w:p>
+    <w:p>
+      <w:pPr>
+        <w:pStyle w:val="Heading1"/>
+      </w:pPr>
+      <w:r>
+        <w:rPr>
+          <w:rFonts w:ascii="Arial" w:hAnsi="Arial"/>
+          <w:color w:val="17212B"/>
+        </w:rPr>
+        <w:t>5. Rifat Mahmud - Event Registration and Participation Lifecycle</w:t>
+      </w:r>
+    </w:p>
+    <w:p>
+      <w:pPr>
+        <w:pStyle w:val="Heading1"/>
+      </w:pPr>
+      <w:r>
+        <w:rPr>
+          <w:rFonts w:ascii="Arial" w:hAnsi="Arial"/>
+          <w:color w:val="17212B"/>
+        </w:rPr>
+        <w:t>5.1 Individual feature statement</w:t>
+      </w:r>
+    </w:p>
+    <w:p>
+      <w:pPr>
+        <w:spacing w:before="100"/>
+      </w:pPr>
+      <w:r>
+        <w:rPr>
+          <w:rFonts w:ascii="Arial" w:hAnsi="Arial"/>
+          <w:b/>
+        </w:rPr>
+        <w:t>“My feature area safely connects students to events. It validates event status, deadlines and capacity, creates a unique QR token, supports cancellation and re-registration, and feeds each confirmed event into the student dashboard.”</w:t>
+      </w:r>
+    </w:p>
+    <w:p>
+      <w:r>
+        <w:rPr>
+          <w:rFonts w:ascii="Arial" w:hAnsi="Arial"/>
+        </w:rPr>
+        <w:t>The working independent feature now covers the complete participation chain: registration, QR pass rendering, executive check-in, attendance synchronization, certificate generation, protected download, revocation, and public verification.</w:t>
+      </w:r>
+    </w:p>
+    <w:p>
+      <w:pPr>
+        <w:pStyle w:val="Heading1"/>
+      </w:pPr>
+      <w:r>
+        <w:rPr>
+          <w:rFonts w:ascii="Arial" w:hAnsi="Arial"/>
+          <w:color w:val="17212B"/>
+        </w:rPr>
+        <w:t>5.2 Implemented now</w:t>
+      </w:r>
+    </w:p>
+    <w:p>
       <w:pPr>
         <w:pStyle w:val="ListBullet"/>
       </w:pPr>
@@ -4353,68 +4414,7 @@
         <w:rPr>
           <w:rFonts w:ascii="Arial" w:hAnsi="Arial"/>
         </w:rPr>
-        <w:t>Attendance-management screen for club executives</w:t>
-      </w:r>
-    </w:p>
-    <w:p>
-      <w:r>
-        <w:br w:type="page"/>
-      </w:r>
-    </w:p>
-    <w:p>
-      <w:pPr>
-        <w:pStyle w:val="Heading1"/>
-      </w:pPr>
-      <w:r>
-        <w:rPr>
-          <w:rFonts w:ascii="Arial" w:hAnsi="Arial"/>
-          <w:color w:val="17212B"/>
-        </w:rPr>
-        <w:t>5. Rifat Mahmud - Event Registration and Participation Lifecycle</w:t>
-      </w:r>
-    </w:p>
-    <w:p>
-      <w:pPr>
-        <w:pStyle w:val="Heading1"/>
-      </w:pPr>
-      <w:r>
-        <w:rPr>
-          <w:rFonts w:ascii="Arial" w:hAnsi="Arial"/>
-          <w:color w:val="17212B"/>
-        </w:rPr>
-        <w:t>5.1 Individual feature statement</w:t>
-      </w:r>
-    </w:p>
-    <w:p>
-      <w:pPr>
-        <w:spacing w:before="100"/>
-      </w:pPr>
-      <w:r>
-        <w:rPr>
-          <w:rFonts w:ascii="Arial" w:hAnsi="Arial"/>
-          <w:b/>
-        </w:rPr>
-        <w:t>“My feature area safely connects students to events. It validates event status, deadlines and capacity, creates a unique QR token, supports cancellation and re-registration, and feeds each confirmed event into the student dashboard.”</w:t>
-      </w:r>
-    </w:p>
-    <w:p>
-      <w:r>
-        <w:rPr>
-          <w:rFonts w:ascii="Arial" w:hAnsi="Arial"/>
-        </w:rPr>
-        <w:t>The working independent feature is event registration and cancellation. Attendance and certificates are normalized and ready for the next implementation phase.</w:t>
-      </w:r>
-    </w:p>
-    <w:p>
-      <w:pPr>
-        <w:pStyle w:val="Heading1"/>
-      </w:pPr>
-      <w:r>
-        <w:rPr>
-          <w:rFonts w:ascii="Arial" w:hAnsi="Arial"/>
-          <w:color w:val="17212B"/>
-        </w:rPr>
-        <w:t>5.2 Implemented now</w:t>
+        <w:t>Browse database-backed events</w:t>
       </w:r>
     </w:p>
     <w:p>
@@ -4425,7 +4425,7 @@
         <w:rPr>
           <w:rFonts w:ascii="Arial" w:hAnsi="Arial"/>
         </w:rPr>
-        <w:t>Browse database-backed events</w:t>
+        <w:t>Search by event, club, venue, or category</w:t>
       </w:r>
     </w:p>
     <w:p>
@@ -4436,7 +4436,7 @@
         <w:rPr>
           <w:rFonts w:ascii="Arial" w:hAnsi="Arial"/>
         </w:rPr>
-        <w:t>Search by event, club, venue, or category</w:t>
+        <w:t>Category filtering</w:t>
       </w:r>
     </w:p>
     <w:p>
@@ -4447,7 +4447,7 @@
         <w:rPr>
           <w:rFonts w:ascii="Arial" w:hAnsi="Arial"/>
         </w:rPr>
-        <w:t>Category filtering</w:t>
+        <w:t>Grid/list view with remembered browser preference</w:t>
       </w:r>
     </w:p>
     <w:p>
@@ -4458,7 +4458,7 @@
         <w:rPr>
           <w:rFonts w:ascii="Arial" w:hAnsi="Arial"/>
         </w:rPr>
-        <w:t>Grid/list view with remembered browser preference</w:t>
+        <w:t>Live capacity counts and indicators</w:t>
       </w:r>
     </w:p>
     <w:p>
@@ -4469,7 +4469,7 @@
         <w:rPr>
           <w:rFonts w:ascii="Arial" w:hAnsi="Arial"/>
         </w:rPr>
-        <w:t>Live capacity counts and indicators</w:t>
+        <w:t>Registration deadline validation</w:t>
       </w:r>
     </w:p>
     <w:p>
@@ -4480,7 +4480,7 @@
         <w:rPr>
           <w:rFonts w:ascii="Arial" w:hAnsi="Arial"/>
         </w:rPr>
-        <w:t>Registration deadline validation</w:t>
+        <w:t>Maximum-capacity validation</w:t>
       </w:r>
     </w:p>
     <w:p>
@@ -4491,7 +4491,7 @@
         <w:rPr>
           <w:rFonts w:ascii="Arial" w:hAnsi="Arial"/>
         </w:rPr>
-        <w:t>Maximum-capacity validation</w:t>
+        <w:t>Cancelled/non-upcoming event validation</w:t>
       </w:r>
     </w:p>
     <w:p>
@@ -4502,7 +4502,7 @@
         <w:rPr>
           <w:rFonts w:ascii="Arial" w:hAnsi="Arial"/>
         </w:rPr>
-        <w:t>Cancelled/non-upcoming event validation</w:t>
+        <w:t>Student-only registration</w:t>
       </w:r>
     </w:p>
     <w:p>
@@ -4513,7 +4513,7 @@
         <w:rPr>
           <w:rFonts w:ascii="Arial" w:hAnsi="Arial"/>
         </w:rPr>
-        <w:t>Student-only registration</w:t>
+        <w:t>Duplicate-safe registration and reactivation after cancellation</w:t>
       </w:r>
     </w:p>
     <w:p>
@@ -4524,7 +4524,7 @@
         <w:rPr>
           <w:rFonts w:ascii="Arial" w:hAnsi="Arial"/>
         </w:rPr>
-        <w:t>Duplicate-safe registration and reactivation after cancellation</w:t>
+        <w:t>Cryptographically unpredictable 64-character QR token generation</w:t>
       </w:r>
     </w:p>
     <w:p>
@@ -4535,7 +4535,7 @@
         <w:rPr>
           <w:rFonts w:ascii="Arial" w:hAnsi="Arial"/>
         </w:rPr>
-        <w:t>Cryptographically unpredictable 64-character QR token generation</w:t>
+        <w:t>Registration cancellation with stored reason</w:t>
       </w:r>
     </w:p>
     <w:p>
@@ -4546,7 +4546,7 @@
         <w:rPr>
           <w:rFonts w:ascii="Arial" w:hAnsi="Arial"/>
         </w:rPr>
-        <w:t>Registration cancellation with stored reason</w:t>
+        <w:t>Transactional registration and row locking</w:t>
       </w:r>
     </w:p>
     <w:p>
@@ -4557,7 +4557,7 @@
         <w:rPr>
           <w:rFonts w:ascii="Arial" w:hAnsi="Arial"/>
         </w:rPr>
-        <w:t>Transactional registration and row locking</w:t>
+        <w:t>Student dashboard list of confirmed upcoming events</w:t>
       </w:r>
     </w:p>
     <w:p>
@@ -4568,7 +4568,7 @@
         <w:rPr>
           <w:rFonts w:ascii="Arial" w:hAnsi="Arial"/>
         </w:rPr>
-        <w:t>Student dashboard list of confirmed upcoming events</w:t>
+        <w:t>Progressive AJAX registration/cancellation with normal form fallback</w:t>
       </w:r>
     </w:p>
     <w:p>
@@ -4579,7 +4579,73 @@
         <w:rPr>
           <w:rFonts w:ascii="Arial" w:hAnsi="Arial"/>
         </w:rPr>
-        <w:t>Progressive AJAX registration/cancellation with normal form fallback</w:t>
+        <w:t>Locally rendered QR passes for every active registration</w:t>
+      </w:r>
+    </w:p>
+    <w:p>
+      <w:pPr>
+        <w:pStyle w:val="ListBullet"/>
+      </w:pPr>
+      <w:r>
+        <w:rPr>
+          <w:rFonts w:ascii="Arial" w:hAnsi="Arial"/>
+        </w:rPr>
+        <w:t>Camera scanning plus email, student-number, and token lookup</w:t>
+      </w:r>
+    </w:p>
+    <w:p>
+      <w:pPr>
+        <w:pStyle w:val="ListBullet"/>
+      </w:pPr>
+      <w:r>
+        <w:rPr>
+          <w:rFonts w:ascii="Arial" w:hAnsi="Arial"/>
+        </w:rPr>
+        <w:t>Club-scoped QR/manual Present and Absent actions</w:t>
+      </w:r>
+    </w:p>
+    <w:p>
+      <w:pPr>
+        <w:pStyle w:val="ListBullet"/>
+      </w:pPr>
+      <w:r>
+        <w:rPr>
+          <w:rFonts w:ascii="Arial" w:hAnsi="Arial"/>
+        </w:rPr>
+        <w:t>Transactional attendance and registration-status synchronization</w:t>
+      </w:r>
+    </w:p>
+    <w:p>
+      <w:pPr>
+        <w:pStyle w:val="ListBullet"/>
+      </w:pPr>
+      <w:r>
+        <w:rPr>
+          <w:rFonts w:ascii="Arial" w:hAnsi="Arial"/>
+        </w:rPr>
+        <w:t>Automatic certificate PDF generation for Present attendance</w:t>
+      </w:r>
+    </w:p>
+    <w:p>
+      <w:pPr>
+        <w:pStyle w:val="ListBullet"/>
+      </w:pPr>
+      <w:r>
+        <w:rPr>
+          <w:rFonts w:ascii="Arial" w:hAnsi="Arial"/>
+        </w:rPr>
+        <w:t>Certificate revocation when attendance changes to Absent</w:t>
+      </w:r>
+    </w:p>
+    <w:p>
+      <w:pPr>
+        <w:pStyle w:val="ListBullet"/>
+      </w:pPr>
+      <w:r>
+        <w:rPr>
+          <w:rFonts w:ascii="Arial" w:hAnsi="Arial"/>
+        </w:rPr>
+        <w:t>Protected student/executive PDF download and public code verification</w:t>
       </w:r>
     </w:p>
     <w:p>
@@ -4973,7 +5039,7 @@
                 <w:color w:val="17212B"/>
                 <w:sz w:val="17"/>
               </w:rPr>
-              <w:t>Unique token used by later attendance workflow</w:t>
+              <w:t>Unique payload rendered and scanned by the attendance workflow</w:t>
             </w:r>
           </w:p>
         </w:tc>
@@ -5642,6 +5708,51 @@
     </w:p>
     <w:p>
       <w:pPr>
+        <w:pStyle w:val="ListNumber"/>
+        <w:numPr>
+          <w:ilvl w:val="0"/>
+          <w:numId w:val="16"/>
+        </w:numPr>
+      </w:pPr>
+      <w:r>
+        <w:rPr>
+          <w:rFonts w:ascii="Arial" w:hAnsi="Arial"/>
+        </w:rPr>
+        <w:t>Open Passes, show the locally rendered QR, and scan or select the registration from Attendance.</w:t>
+      </w:r>
+    </w:p>
+    <w:p>
+      <w:pPr>
+        <w:pStyle w:val="ListNumber"/>
+        <w:numPr>
+          <w:ilvl w:val="0"/>
+          <w:numId w:val="16"/>
+        </w:numPr>
+      </w:pPr>
+      <w:r>
+        <w:rPr>
+          <w:rFonts w:ascii="Arial" w:hAnsi="Arial"/>
+        </w:rPr>
+        <w:t>Mark Present, download the generated PDF, and verify its public code.</w:t>
+      </w:r>
+    </w:p>
+    <w:p>
+      <w:pPr>
+        <w:pStyle w:val="ListNumber"/>
+        <w:numPr>
+          <w:ilvl w:val="0"/>
+          <w:numId w:val="16"/>
+        </w:numPr>
+      </w:pPr>
+      <w:r>
+        <w:rPr>
+          <w:rFonts w:ascii="Arial" w:hAnsi="Arial"/>
+        </w:rPr>
+        <w:t>Correct the record to Absent and show that the certificate becomes Revoked.</w:t>
+      </w:r>
+    </w:p>
+    <w:p>
+      <w:pPr>
         <w:pStyle w:val="Heading1"/>
       </w:pPr>
       <w:r>
@@ -5775,7 +5886,7 @@
           <w:rFonts w:ascii="Arial" w:hAnsi="Arial"/>
           <w:color w:val="17212B"/>
         </w:rPr>
-        <w:t>5.9 Schema-ready / next phase</w:t>
+        <w:t>5.9 Next phase</w:t>
       </w:r>
     </w:p>
     <w:p>
@@ -5786,7 +5897,7 @@
         <w:rPr>
           <w:rFonts w:ascii="Arial" w:hAnsi="Arial"/>
         </w:rPr>
-        <w:t>Registration detail/history page</w:t>
+        <w:t>Registration detail/history export</w:t>
       </w:r>
     </w:p>
     <w:p>
@@ -5797,7 +5908,7 @@
         <w:rPr>
           <w:rFonts w:ascii="Arial" w:hAnsi="Arial"/>
         </w:rPr>
-        <w:t>QR image rendering and scanning interface</w:t>
+        <w:t>Bulk attendance import</w:t>
       </w:r>
     </w:p>
     <w:p>
@@ -5808,7 +5919,7 @@
         <w:rPr>
           <w:rFonts w:ascii="Arial" w:hAnsi="Arial"/>
         </w:rPr>
-        <w:t>Manual and QR attendance screens</w:t>
+        <w:t>Feedback submission after Present attendance</w:t>
       </w:r>
     </w:p>
     <w:p>
@@ -5819,7 +5930,68 @@
         <w:rPr>
           <w:rFonts w:ascii="Arial" w:hAnsi="Arial"/>
         </w:rPr>
-        <w:t>Attendance eligibility enforcement in UI</w:t>
+        <w:t>Optional email reminders</w:t>
+      </w:r>
+    </w:p>
+    <w:p>
+      <w:r>
+        <w:br w:type="page"/>
+      </w:r>
+    </w:p>
+    <w:p>
+      <w:pPr>
+        <w:pStyle w:val="Heading1"/>
+      </w:pPr>
+      <w:r>
+        <w:rPr>
+          <w:rFonts w:ascii="Arial" w:hAnsi="Arial"/>
+          <w:color w:val="17212B"/>
+        </w:rPr>
+        <w:t>6. Faisal Mahbub - Dashboards, Notifications, Reporting, and Engagement</w:t>
+      </w:r>
+    </w:p>
+    <w:p>
+      <w:pPr>
+        <w:pStyle w:val="Heading1"/>
+      </w:pPr>
+      <w:r>
+        <w:rPr>
+          <w:rFonts w:ascii="Arial" w:hAnsi="Arial"/>
+          <w:color w:val="17212B"/>
+        </w:rPr>
+        <w:t>6.1 Individual feature statement</w:t>
+      </w:r>
+    </w:p>
+    <w:p>
+      <w:pPr>
+        <w:spacing w:before="100"/>
+      </w:pPr>
+      <w:r>
+        <w:rPr>
+          <w:rFonts w:ascii="Arial" w:hAnsi="Arial"/>
+          <w:b/>
+        </w:rPr>
+        <w:t>“My feature area turns relational data into useful role-aware information. The same dashboard recognizes students, club executives, and administrators, then displays the statistics, alerts, queues, and actions appropriate to their authority.”</w:t>
+      </w:r>
+    </w:p>
+    <w:p>
+      <w:r>
+        <w:rPr>
+          <w:rFonts w:ascii="Arial" w:hAnsi="Arial"/>
+        </w:rPr>
+        <w:t>The implemented independent feature combines the role-aware dashboard with a working notification centre and announcement publishing lifecycle. Advanced feedback CRUD, leaderboard formulas, and full reports remain next-phase modules.</w:t>
+      </w:r>
+    </w:p>
+    <w:p>
+      <w:pPr>
+        <w:pStyle w:val="Heading1"/>
+      </w:pPr>
+      <w:r>
+        <w:rPr>
+          <w:rFonts w:ascii="Arial" w:hAnsi="Arial"/>
+          <w:color w:val="17212B"/>
+        </w:rPr>
+        <w:t>6.2 Implemented now</w:t>
       </w:r>
     </w:p>
     <w:p>
@@ -5830,7 +6002,7 @@
         <w:rPr>
           <w:rFonts w:ascii="Arial" w:hAnsi="Arial"/>
         </w:rPr>
-        <w:t>Certificate file generation/download</w:t>
+        <w:t>Role-aware Student, Executive, and Administrator dashboard branches</w:t>
       </w:r>
     </w:p>
     <w:p>
@@ -5841,68 +6013,7 @@
         <w:rPr>
           <w:rFonts w:ascii="Arial" w:hAnsi="Arial"/>
         </w:rPr>
-        <w:t>Reminder creation through notifications</w:t>
-      </w:r>
-    </w:p>
-    <w:p>
-      <w:r>
-        <w:br w:type="page"/>
-      </w:r>
-    </w:p>
-    <w:p>
-      <w:pPr>
-        <w:pStyle w:val="Heading1"/>
-      </w:pPr>
-      <w:r>
-        <w:rPr>
-          <w:rFonts w:ascii="Arial" w:hAnsi="Arial"/>
-          <w:color w:val="17212B"/>
-        </w:rPr>
-        <w:t>6. Faisal Mahbub - Dashboards, Notifications, Reporting, and Engagement</w:t>
-      </w:r>
-    </w:p>
-    <w:p>
-      <w:pPr>
-        <w:pStyle w:val="Heading1"/>
-      </w:pPr>
-      <w:r>
-        <w:rPr>
-          <w:rFonts w:ascii="Arial" w:hAnsi="Arial"/>
-          <w:color w:val="17212B"/>
-        </w:rPr>
-        <w:t>6.1 Individual feature statement</w:t>
-      </w:r>
-    </w:p>
-    <w:p>
-      <w:pPr>
-        <w:spacing w:before="100"/>
-      </w:pPr>
-      <w:r>
-        <w:rPr>
-          <w:rFonts w:ascii="Arial" w:hAnsi="Arial"/>
-          <w:b/>
-        </w:rPr>
-        <w:t>“My feature area turns relational data into useful role-aware information. The same dashboard recognizes students, club executives, and administrators, then displays the statistics, alerts, queues, and actions appropriate to their authority.”</w:t>
-      </w:r>
-    </w:p>
-    <w:p>
-      <w:r>
-        <w:rPr>
-          <w:rFonts w:ascii="Arial" w:hAnsi="Arial"/>
-        </w:rPr>
-        <w:t>The implemented independent feature is the role-aware live dashboard and engagement presentation. Notifications are read and displayed from the database. Advanced feedback CRUD, leaderboard formulas, and full reports remain next-phase modules.</w:t>
-      </w:r>
-    </w:p>
-    <w:p>
-      <w:pPr>
-        <w:pStyle w:val="Heading1"/>
-      </w:pPr>
-      <w:r>
-        <w:rPr>
-          <w:rFonts w:ascii="Arial" w:hAnsi="Arial"/>
-          <w:color w:val="17212B"/>
-        </w:rPr>
-        <w:t>6.2 Implemented now</w:t>
+        <w:t>Real database statistics rather than hard-coded totals</w:t>
       </w:r>
     </w:p>
     <w:p>
@@ -5913,7 +6024,7 @@
         <w:rPr>
           <w:rFonts w:ascii="Arial" w:hAnsi="Arial"/>
         </w:rPr>
-        <w:t>Role-aware Student, Executive, and Administrator dashboard branches</w:t>
+        <w:t>Student upcoming-registration agenda</w:t>
       </w:r>
     </w:p>
     <w:p>
@@ -5924,7 +6035,7 @@
         <w:rPr>
           <w:rFonts w:ascii="Arial" w:hAnsi="Arial"/>
         </w:rPr>
-        <w:t>Real database statistics rather than hard-coded totals</w:t>
+        <w:t>Student membership total</w:t>
       </w:r>
     </w:p>
     <w:p>
@@ -5935,7 +6046,7 @@
         <w:rPr>
           <w:rFonts w:ascii="Arial" w:hAnsi="Arial"/>
         </w:rPr>
-        <w:t>Student upcoming-registration agenda</w:t>
+        <w:t>Latest user notifications with read/unread state</w:t>
       </w:r>
     </w:p>
     <w:p>
@@ -5946,7 +6057,7 @@
         <w:rPr>
           <w:rFonts w:ascii="Arial" w:hAnsi="Arial"/>
         </w:rPr>
-        <w:t>Student membership total</w:t>
+        <w:t>Executive assigned-club count</w:t>
       </w:r>
     </w:p>
     <w:p>
@@ -5957,7 +6068,7 @@
         <w:rPr>
           <w:rFonts w:ascii="Arial" w:hAnsi="Arial"/>
         </w:rPr>
-        <w:t>Latest user notifications with read/unread state</w:t>
+        <w:t>Executive pending membership queue</w:t>
       </w:r>
     </w:p>
     <w:p>
@@ -5968,7 +6079,7 @@
         <w:rPr>
           <w:rFonts w:ascii="Arial" w:hAnsi="Arial"/>
         </w:rPr>
-        <w:t>Executive assigned-club count</w:t>
+        <w:t>Executive event capacity snapshots</w:t>
       </w:r>
     </w:p>
     <w:p>
@@ -5979,7 +6090,7 @@
         <w:rPr>
           <w:rFonts w:ascii="Arial" w:hAnsi="Arial"/>
         </w:rPr>
-        <w:t>Executive pending membership queue</w:t>
+        <w:t>Administrator user, club, registration, and event totals</w:t>
       </w:r>
     </w:p>
     <w:p>
@@ -5990,7 +6101,7 @@
         <w:rPr>
           <w:rFonts w:ascii="Arial" w:hAnsi="Arial"/>
         </w:rPr>
-        <w:t>Executive event capacity snapshots</w:t>
+        <w:t>Administrator club moderation queue</w:t>
       </w:r>
     </w:p>
     <w:p>
@@ -6001,7 +6112,7 @@
         <w:rPr>
           <w:rFonts w:ascii="Arial" w:hAnsi="Arial"/>
         </w:rPr>
-        <w:t>Administrator user, club, registration, and event totals</w:t>
+        <w:t>Homepage database statistics, upcoming stories, activity, and calls to action</w:t>
       </w:r>
     </w:p>
     <w:p>
@@ -6012,7 +6123,7 @@
         <w:rPr>
           <w:rFonts w:ascii="Arial" w:hAnsi="Arial"/>
         </w:rPr>
-        <w:t>Administrator club moderation queue</w:t>
+        <w:t>Animated statistics, reveal motion, toast feedback, and reduced interface friction</w:t>
       </w:r>
     </w:p>
     <w:p>
@@ -6023,7 +6134,7 @@
         <w:rPr>
           <w:rFonts w:ascii="Arial" w:hAnsi="Arial"/>
         </w:rPr>
-        <w:t>Homepage database statistics, upcoming stories, activity, and calls to action</w:t>
+        <w:t>Seeded announcements and notifications for demonstration</w:t>
       </w:r>
     </w:p>
     <w:p>
@@ -6034,7 +6145,7 @@
         <w:rPr>
           <w:rFonts w:ascii="Arial" w:hAnsi="Arial"/>
         </w:rPr>
-        <w:t>Animated statistics, reveal motion, toast feedback, and reduced interface friction</w:t>
+        <w:t>Club and system announcement create/edit/activate/expire/remove lifecycle</w:t>
       </w:r>
     </w:p>
     <w:p>
@@ -6045,7 +6156,29 @@
         <w:rPr>
           <w:rFonts w:ascii="Arial" w:hAnsi="Arial"/>
         </w:rPr>
-        <w:t>Seeded announcements and notifications for demonstration</w:t>
+        <w:t>One-time transaction-protected notification fan-out to eligible recipients</w:t>
+      </w:r>
+    </w:p>
+    <w:p>
+      <w:pPr>
+        <w:pStyle w:val="ListBullet"/>
+      </w:pPr>
+      <w:r>
+        <w:rPr>
+          <w:rFonts w:ascii="Arial" w:hAnsi="Arial"/>
+        </w:rPr>
+        <w:t>Paginated notification inbox, unread badge, individual read, and read-all actions</w:t>
+      </w:r>
+    </w:p>
+    <w:p>
+      <w:pPr>
+        <w:pStyle w:val="ListBullet"/>
+      </w:pPr>
+      <w:r>
+        <w:rPr>
+          <w:rFonts w:ascii="Arial" w:hAnsi="Arial"/>
+        </w:rPr>
+        <w:t>Automatic certificate, attendance, and announcement notifications</w:t>
       </w:r>
     </w:p>
     <w:p>
@@ -6410,38 +6543,33 @@
         <w:rPr>
           <w:rFonts w:ascii="Arial" w:hAnsi="Arial"/>
         </w:rPr>
-        <w:t>The current seed data and dashboard demonstrate reading notifications. Full announcement publishing and notification state-management pages are planned.</w:t>
-      </w:r>
-    </w:p>
-    <w:p>
-      <w:pPr>
-        <w:pStyle w:val="Heading1"/>
-      </w:pPr>
-      <w:r>
-        <w:rPr>
-          <w:rFonts w:ascii="Arial" w:hAnsi="Arial"/>
-          <w:color w:val="17212B"/>
-        </w:rPr>
-        <w:t>6.6 Files to know</w:t>
-      </w:r>
-    </w:p>
-    <w:p>
-      <w:pPr>
-        <w:pStyle w:val="ListBullet"/>
-      </w:pPr>
+        <w:t xml:space="preserve">The publishing desk supports drafts and first activation, records </w:t>
+      </w:r>
       <w:r>
         <w:rPr>
           <w:rFonts w:ascii="Consolas" w:hAnsi="Consolas"/>
           <w:color w:val="BD4F3C"/>
           <w:sz w:val="19"/>
         </w:rPr>
-        <w:t>dashboard.php</w:t>
-      </w:r>
-      <w:r>
-        <w:rPr>
-          <w:rFonts w:ascii="Arial" w:hAnsi="Arial"/>
-        </w:rPr>
-        <w:t xml:space="preserve"> - all three role-aware dashboard branches</w:t>
+        <w:t>notified_at</w:t>
+      </w:r>
+      <w:r>
+        <w:rPr>
+          <w:rFonts w:ascii="Arial" w:hAnsi="Arial"/>
+        </w:rPr>
+        <w:t xml:space="preserve"> to prevent duplicate fan-out, and automatically expires dated notices. The inbox supports paginated recipient-only reading, individual mark-as-read, read-all, and a live unread badge.</w:t>
+      </w:r>
+    </w:p>
+    <w:p>
+      <w:pPr>
+        <w:pStyle w:val="Heading1"/>
+      </w:pPr>
+      <w:r>
+        <w:rPr>
+          <w:rFonts w:ascii="Arial" w:hAnsi="Arial"/>
+          <w:color w:val="17212B"/>
+        </w:rPr>
+        <w:t>6.6 Files to know</w:t>
       </w:r>
     </w:p>
     <w:p>
@@ -6454,6 +6582,25 @@
           <w:color w:val="BD4F3C"/>
           <w:sz w:val="19"/>
         </w:rPr>
+        <w:t>dashboard.php</w:t>
+      </w:r>
+      <w:r>
+        <w:rPr>
+          <w:rFonts w:ascii="Arial" w:hAnsi="Arial"/>
+        </w:rPr>
+        <w:t xml:space="preserve"> - all three role-aware dashboard branches</w:t>
+      </w:r>
+    </w:p>
+    <w:p>
+      <w:pPr>
+        <w:pStyle w:val="ListBullet"/>
+      </w:pPr>
+      <w:r>
+        <w:rPr>
+          <w:rFonts w:ascii="Consolas" w:hAnsi="Consolas"/>
+          <w:color w:val="BD4F3C"/>
+          <w:sz w:val="19"/>
+        </w:rPr>
         <w:t>index.php</w:t>
       </w:r>
       <w:r>
@@ -6461,6 +6608,72 @@
           <w:rFonts w:ascii="Arial" w:hAnsi="Arial"/>
         </w:rPr>
         <w:t xml:space="preserve"> - public statistics and active campus content</w:t>
+      </w:r>
+    </w:p>
+    <w:p>
+      <w:pPr>
+        <w:pStyle w:val="ListBullet"/>
+      </w:pPr>
+      <w:r>
+        <w:rPr>
+          <w:rFonts w:ascii="Consolas" w:hAnsi="Consolas"/>
+          <w:color w:val="BD4F3C"/>
+          <w:sz w:val="19"/>
+        </w:rPr>
+        <w:t>announcements.php</w:t>
+      </w:r>
+      <w:r>
+        <w:rPr>
+          <w:rFonts w:ascii="Arial" w:hAnsi="Arial"/>
+        </w:rPr>
+        <w:t xml:space="preserve"> and </w:t>
+      </w:r>
+      <w:r>
+        <w:rPr>
+          <w:rFonts w:ascii="Consolas" w:hAnsi="Consolas"/>
+          <w:color w:val="BD4F3C"/>
+          <w:sz w:val="19"/>
+        </w:rPr>
+        <w:t>api/announcement.php</w:t>
+      </w:r>
+      <w:r>
+        <w:rPr>
+          <w:rFonts w:ascii="Arial" w:hAnsi="Arial"/>
+        </w:rPr>
+        <w:t xml:space="preserve"> - publishing lifecycle and one-time fan-out</w:t>
+      </w:r>
+    </w:p>
+    <w:p>
+      <w:pPr>
+        <w:pStyle w:val="ListBullet"/>
+      </w:pPr>
+      <w:r>
+        <w:rPr>
+          <w:rFonts w:ascii="Consolas" w:hAnsi="Consolas"/>
+          <w:color w:val="BD4F3C"/>
+          <w:sz w:val="19"/>
+        </w:rPr>
+        <w:t>notifications.php</w:t>
+      </w:r>
+      <w:r>
+        <w:rPr>
+          <w:rFonts w:ascii="Arial" w:hAnsi="Arial"/>
+        </w:rPr>
+        <w:t xml:space="preserve"> and </w:t>
+      </w:r>
+      <w:r>
+        <w:rPr>
+          <w:rFonts w:ascii="Consolas" w:hAnsi="Consolas"/>
+          <w:color w:val="BD4F3C"/>
+          <w:sz w:val="19"/>
+        </w:rPr>
+        <w:t>api/notification.php</w:t>
+      </w:r>
+      <w:r>
+        <w:rPr>
+          <w:rFonts w:ascii="Arial" w:hAnsi="Arial"/>
+        </w:rPr>
+        <w:t xml:space="preserve"> - recipient inbox and read state</w:t>
       </w:r>
     </w:p>
     <w:p>
@@ -6636,6 +6849,50 @@
     </w:p>
     <w:p>
       <w:pPr>
+        <w:pStyle w:val="ListNumber"/>
+        <w:numPr>
+          <w:ilvl w:val="0"/>
+          <w:numId w:val="18"/>
+        </w:numPr>
+      </w:pPr>
+      <w:r>
+        <w:rPr>
+          <w:rFonts w:ascii="Arial" w:hAnsi="Arial"/>
+        </w:rPr>
+        <w:t>Publish a club notice as an Executive and show its delivery in a member’s inbox.</w:t>
+      </w:r>
+    </w:p>
+    <w:p>
+      <w:pPr>
+        <w:pStyle w:val="ListNumber"/>
+        <w:numPr>
+          <w:ilvl w:val="0"/>
+          <w:numId w:val="18"/>
+        </w:numPr>
+      </w:pPr>
+      <w:r>
+        <w:rPr>
+          <w:rFonts w:ascii="Arial" w:hAnsi="Arial"/>
+        </w:rPr>
+        <w:t xml:space="preserve">Mark the notification read and explain how </w:t>
+      </w:r>
+      <w:r>
+        <w:rPr>
+          <w:rFonts w:ascii="Consolas" w:hAnsi="Consolas"/>
+          <w:color w:val="BD4F3C"/>
+          <w:sz w:val="19"/>
+        </w:rPr>
+        <w:t>notified_at</w:t>
+      </w:r>
+      <w:r>
+        <w:rPr>
+          <w:rFonts w:ascii="Arial" w:hAnsi="Arial"/>
+        </w:rPr>
+        <w:t xml:space="preserve"> prevents duplicate fan-out after editing.</w:t>
+      </w:r>
+    </w:p>
+    <w:p>
+      <w:pPr>
         <w:pStyle w:val="Heading1"/>
       </w:pPr>
       <w:r>
@@ -6755,29 +7012,7 @@
           <w:rFonts w:ascii="Arial" w:hAnsi="Arial"/>
           <w:color w:val="17212B"/>
         </w:rPr>
-        <w:t>6.9 Schema-ready / next phase</w:t>
-      </w:r>
-    </w:p>
-    <w:p>
-      <w:pPr>
-        <w:pStyle w:val="ListBullet"/>
-      </w:pPr>
-      <w:r>
-        <w:rPr>
-          <w:rFonts w:ascii="Arial" w:hAnsi="Arial"/>
-        </w:rPr>
-        <w:t>Notification inbox and mark-as-read actions</w:t>
-      </w:r>
-    </w:p>
-    <w:p>
-      <w:pPr>
-        <w:pStyle w:val="ListBullet"/>
-      </w:pPr>
-      <w:r>
-        <w:rPr>
-          <w:rFonts w:ascii="Arial" w:hAnsi="Arial"/>
-        </w:rPr>
-        <w:t>Announcement create/update/expiry management</w:t>
+        <w:t>6.9 Next phase</w:t>
       </w:r>
     </w:p>
     <w:p>
@@ -6875,8 +7110,8 @@
       <w:r>
         <w:drawing>
           <wp:inline xmlns:a="http://schemas.openxmlformats.org/drawingml/2006/main" xmlns:pic="http://schemas.openxmlformats.org/drawingml/2006/picture">
-            <wp:extent cx="5806440" cy="3629025"/>
-            <wp:docPr id="4" name="Picture 4" descr="Tarannum Diha's club authority produces managed events, Rifat Mahmud's registrations produce participation data, and Faisal Mahbub's dashboards convert it into insight." title="Figure 4. Three feature owners, one integrated workflow"/>
+            <wp:extent cx="5806440" cy="2787091"/>
+            <wp:docPr id="4" name="Picture 4" descr="Tarannum Diha's club authority produces managed events, Rifat Mahmud verifies attendance and certificates, and Faisal Mahbub publishes recipient-specific engagement updates." title="Figure 4. Three feature owners, one integrated workflow"/>
             <wp:cNvGraphicFramePr>
               <a:graphicFrameLocks noChangeAspect="1"/>
             </wp:cNvGraphicFramePr>
@@ -6896,7 +7131,7 @@
                   <pic:spPr>
                     <a:xfrm>
                       <a:off x="0" y="0"/>
-                      <a:ext cx="5806440" cy="3629025"/>
+                      <a:ext cx="5806440" cy="2787091"/>
                     </a:xfrm>
                     <a:prstGeom prst="rect"/>
                   </pic:spPr>
@@ -7024,7 +7259,7 @@
         <w:rPr>
           <w:rFonts w:ascii="Arial" w:hAnsi="Arial"/>
         </w:rPr>
-        <w:t>Future attendance changes the registration to Attended or Absent.</w:t>
+        <w:t>Executive attendance changes the registration to Attended or Absent in the same transaction.</w:t>
       </w:r>
     </w:p>
     <w:p>
@@ -7039,7 +7274,7 @@
         <w:rPr>
           <w:rFonts w:ascii="Arial" w:hAnsi="Arial"/>
         </w:rPr>
-        <w:t>Present attendance enables certificates and feedback.</w:t>
+        <w:t>Present attendance issues a certificate; a later Absent correction revokes it.</w:t>
       </w:r>
     </w:p>
     <w:p>
@@ -7959,7 +8194,7 @@
                 <w:color w:val="17212B"/>
                 <w:sz w:val="16"/>
               </w:rPr>
-              <w:t>Not yet</w:t>
+              <w:t>Yes</w:t>
             </w:r>
           </w:p>
         </w:tc>
@@ -7985,7 +8220,7 @@
                 <w:color w:val="17212B"/>
                 <w:sz w:val="16"/>
               </w:rPr>
-              <w:t>Schema-ready</w:t>
+              <w:t>QR/manual mark and correction</w:t>
             </w:r>
           </w:p>
         </w:tc>
@@ -8088,7 +8323,7 @@
                 <w:color w:val="17212B"/>
                 <w:sz w:val="16"/>
               </w:rPr>
-              <w:t>Not yet</w:t>
+              <w:t>Yes</w:t>
             </w:r>
           </w:p>
         </w:tc>
@@ -8113,7 +8348,7 @@
                 <w:color w:val="17212B"/>
                 <w:sz w:val="16"/>
               </w:rPr>
-              <w:t>Schema-ready</w:t>
+              <w:t>Issue/revoke/download/verify</w:t>
             </w:r>
           </w:p>
         </w:tc>
@@ -8218,7 +8453,7 @@
                 <w:color w:val="17212B"/>
                 <w:sz w:val="16"/>
               </w:rPr>
-              <w:t>Dashboard read</w:t>
+              <w:t>Yes</w:t>
             </w:r>
           </w:p>
         </w:tc>
@@ -8244,7 +8479,7 @@
                 <w:color w:val="17212B"/>
                 <w:sz w:val="16"/>
               </w:rPr>
-              <w:t>Read display</w:t>
+              <w:t>Paginated read/read-all/fan-out</w:t>
             </w:r>
           </w:p>
         </w:tc>
@@ -8347,7 +8582,7 @@
                 <w:color w:val="17212B"/>
                 <w:sz w:val="16"/>
               </w:rPr>
-              <w:t>Seed/home content</w:t>
+              <w:t>Yes</w:t>
             </w:r>
           </w:p>
         </w:tc>
@@ -8372,7 +8607,7 @@
                 <w:color w:val="17212B"/>
                 <w:sz w:val="16"/>
               </w:rPr>
-              <w:t>Read display</w:t>
+              <w:t>Draft/activate/edit/expire/remove</w:t>
             </w:r>
           </w:p>
         </w:tc>
@@ -9045,7 +9280,7 @@
                 <w:color w:val="BD4F3C"/>
                 <w:sz w:val="15"/>
               </w:rPr>
-              <w:t>amina@student.edu</w:t>
+              <w:t>amina.rahman@g.bracu.ac.bd</w:t>
             </w:r>
           </w:p>
         </w:tc>
@@ -9149,7 +9384,7 @@
                 <w:color w:val="BD4F3C"/>
                 <w:sz w:val="15"/>
               </w:rPr>
-              <w:t>nafis@student.edu</w:t>
+              <w:t>nafis.karim@g.bracu.ac.bd</w:t>
             </w:r>
           </w:p>
         </w:tc>
@@ -9319,7 +9554,7 @@
         <w:rPr>
           <w:rFonts w:ascii="Arial" w:hAnsi="Arial"/>
         </w:rPr>
-        <w:t xml:space="preserve">The legacy demo addresses remain usable for login. Newly created student accounts must use </w:t>
+        <w:t xml:space="preserve">Fresh seed data uses BRACU-format student addresses, and newly created student accounts must use </w:t>
       </w:r>
       <w:r>
         <w:rPr>
@@ -9333,7 +9568,7 @@
         <w:rPr>
           <w:rFonts w:ascii="Arial" w:hAnsi="Arial"/>
         </w:rPr>
-        <w:t>.</w:t>
+        <w:t>. Existing installations preserve their previously seeded login addresses when upgraded without reset.</w:t>
       </w:r>
     </w:p>
     <w:p>
@@ -9390,7 +9625,7 @@
         <w:rPr>
           <w:rFonts w:ascii="Arial" w:hAnsi="Arial"/>
         </w:rPr>
-        <w:t>Rifat: register for the newly created event, show capacity and dashboard.</w:t>
+        <w:t>Rifat: register, show the QR pass, check in, download the certificate, and verify its public code.</w:t>
       </w:r>
     </w:p>
     <w:p>
@@ -9405,7 +9640,7 @@
         <w:rPr>
           <w:rFonts w:ascii="Arial" w:hAnsi="Arial"/>
         </w:rPr>
-        <w:t>Faisal: show role-aware dashboards and explain how the actions became statistics/alerts.</w:t>
+        <w:t>Faisal: publish a club notice, show the one-time inbox delivery, then demonstrate read state and role-aware dashboards.</w:t>
       </w:r>
     </w:p>
     <w:p>
@@ -10047,7 +10282,7 @@
                 <w:color w:val="BD4F3C"/>
                 <w:sz w:val="16"/>
               </w:rPr>
-              <w:t>includes/bootstrap.php</w:t>
+              <w:t>dashboard.php</w:t>
             </w:r>
           </w:p>
         </w:tc>
@@ -10073,7 +10308,7 @@
                 <w:color w:val="17212B"/>
                 <w:sz w:val="17"/>
               </w:rPr>
-              <w:t>Shared startup/session/database loading</w:t>
+              <w:t>Student/executive/admin dashboard and module shortcuts</w:t>
             </w:r>
           </w:p>
         </w:tc>
@@ -10100,7 +10335,39 @@
                 <w:color w:val="BD4F3C"/>
                 <w:sz w:val="16"/>
               </w:rPr>
-              <w:t>includes/functions.php</w:t>
+              <w:t>attendance.php</w:t>
+            </w:r>
+            <w:r>
+              <w:rPr>
+                <w:rFonts w:ascii="Arial" w:hAnsi="Arial"/>
+                <w:color w:val="17212B"/>
+                <w:sz w:val="17"/>
+              </w:rPr>
+              <w:t xml:space="preserve"> / </w:t>
+            </w:r>
+            <w:r>
+              <w:rPr>
+                <w:rFonts w:ascii="Consolas" w:hAnsi="Consolas"/>
+                <w:color w:val="BD4F3C"/>
+                <w:sz w:val="16"/>
+              </w:rPr>
+              <w:t>certificates.php</w:t>
+            </w:r>
+            <w:r>
+              <w:rPr>
+                <w:rFonts w:ascii="Arial" w:hAnsi="Arial"/>
+                <w:color w:val="17212B"/>
+                <w:sz w:val="17"/>
+              </w:rPr>
+              <w:t xml:space="preserve"> / </w:t>
+            </w:r>
+            <w:r>
+              <w:rPr>
+                <w:rFonts w:ascii="Consolas" w:hAnsi="Consolas"/>
+                <w:color w:val="BD4F3C"/>
+                <w:sz w:val="16"/>
+              </w:rPr>
+              <w:t>verify-certificate.php</w:t>
             </w:r>
           </w:p>
         </w:tc>
@@ -10125,7 +10392,7 @@
                 <w:color w:val="17212B"/>
                 <w:sz w:val="17"/>
               </w:rPr>
-              <w:t>Security, role, authorization, and output helpers</w:t>
+              <w:t>Attendance, passes, downloads, and verification UI</w:t>
             </w:r>
           </w:p>
         </w:tc>
@@ -10153,7 +10420,7 @@
                 <w:color w:val="BD4F3C"/>
                 <w:sz w:val="16"/>
               </w:rPr>
-              <w:t>signup.php</w:t>
+              <w:t>announcements.php</w:t>
             </w:r>
             <w:r>
               <w:rPr>
@@ -10169,7 +10436,7 @@
                 <w:color w:val="BD4F3C"/>
                 <w:sz w:val="16"/>
               </w:rPr>
-              <w:t>login.php</w:t>
+              <w:t>notifications.php</w:t>
             </w:r>
           </w:p>
         </w:tc>
@@ -10195,219 +10462,7 @@
                 <w:color w:val="17212B"/>
                 <w:sz w:val="17"/>
               </w:rPr>
-              <w:t>Authentication</w:t>
-            </w:r>
-          </w:p>
-        </w:tc>
-      </w:tr>
-      <w:tr>
-        <w:tc>
-          <w:tcPr>
-            <w:tcW w:type="dxa" w:w="2800"/>
-            <w:vAlign w:val="center"/>
-            <w:tcMar>
-              <w:top w:w="110" w:type="dxa"/>
-              <w:start w:w="120" w:type="dxa"/>
-              <w:bottom w:w="110" w:type="dxa"/>
-              <w:end w:w="120" w:type="dxa"/>
-            </w:tcMar>
-          </w:tcPr>
-          <w:p>
-            <w:pPr>
-              <w:spacing w:after="0"/>
-            </w:pPr>
-            <w:r>
-              <w:rPr>
-                <w:rFonts w:ascii="Consolas" w:hAnsi="Consolas"/>
-                <w:color w:val="BD4F3C"/>
-                <w:sz w:val="16"/>
-              </w:rPr>
-              <w:t>clubs.php</w:t>
-            </w:r>
-          </w:p>
-        </w:tc>
-        <w:tc>
-          <w:tcPr>
-            <w:tcW w:type="dxa" w:w="6320"/>
-            <w:vAlign w:val="center"/>
-            <w:tcMar>
-              <w:top w:w="110" w:type="dxa"/>
-              <w:start w:w="120" w:type="dxa"/>
-              <w:bottom w:w="110" w:type="dxa"/>
-              <w:end w:w="120" w:type="dxa"/>
-            </w:tcMar>
-          </w:tcPr>
-          <w:p>
-            <w:pPr>
-              <w:spacing w:after="0"/>
-            </w:pPr>
-            <w:r>
-              <w:rPr>
-                <w:rFonts w:ascii="Arial" w:hAnsi="Arial"/>
-                <w:color w:val="17212B"/>
-                <w:sz w:val="17"/>
-              </w:rPr>
-              <w:t>Club discovery and management</w:t>
-            </w:r>
-          </w:p>
-        </w:tc>
-      </w:tr>
-      <w:tr>
-        <w:tc>
-          <w:tcPr>
-            <w:tcW w:type="dxa" w:w="2800"/>
-            <w:shd w:fill="F8F1E5"/>
-            <w:vAlign w:val="center"/>
-            <w:tcMar>
-              <w:top w:w="110" w:type="dxa"/>
-              <w:start w:w="120" w:type="dxa"/>
-              <w:bottom w:w="110" w:type="dxa"/>
-              <w:end w:w="120" w:type="dxa"/>
-            </w:tcMar>
-          </w:tcPr>
-          <w:p>
-            <w:pPr>
-              <w:spacing w:after="0"/>
-            </w:pPr>
-            <w:r>
-              <w:rPr>
-                <w:rFonts w:ascii="Consolas" w:hAnsi="Consolas"/>
-                <w:color w:val="BD4F3C"/>
-                <w:sz w:val="16"/>
-              </w:rPr>
-              <w:t>memberships.php</w:t>
-            </w:r>
-          </w:p>
-        </w:tc>
-        <w:tc>
-          <w:tcPr>
-            <w:tcW w:type="dxa" w:w="6320"/>
-            <w:shd w:fill="F8F1E5"/>
-            <w:vAlign w:val="center"/>
-            <w:tcMar>
-              <w:top w:w="110" w:type="dxa"/>
-              <w:start w:w="120" w:type="dxa"/>
-              <w:bottom w:w="110" w:type="dxa"/>
-              <w:end w:w="120" w:type="dxa"/>
-            </w:tcMar>
-          </w:tcPr>
-          <w:p>
-            <w:pPr>
-              <w:spacing w:after="0"/>
-            </w:pPr>
-            <w:r>
-              <w:rPr>
-                <w:rFonts w:ascii="Arial" w:hAnsi="Arial"/>
-                <w:color w:val="17212B"/>
-                <w:sz w:val="17"/>
-              </w:rPr>
-              <w:t>Membership and executive-role management</w:t>
-            </w:r>
-          </w:p>
-        </w:tc>
-      </w:tr>
-      <w:tr>
-        <w:tc>
-          <w:tcPr>
-            <w:tcW w:type="dxa" w:w="2800"/>
-            <w:vAlign w:val="center"/>
-            <w:tcMar>
-              <w:top w:w="110" w:type="dxa"/>
-              <w:start w:w="120" w:type="dxa"/>
-              <w:bottom w:w="110" w:type="dxa"/>
-              <w:end w:w="120" w:type="dxa"/>
-            </w:tcMar>
-          </w:tcPr>
-          <w:p>
-            <w:pPr>
-              <w:spacing w:after="0"/>
-            </w:pPr>
-            <w:r>
-              <w:rPr>
-                <w:rFonts w:ascii="Consolas" w:hAnsi="Consolas"/>
-                <w:color w:val="BD4F3C"/>
-                <w:sz w:val="16"/>
-              </w:rPr>
-              <w:t>events.php</w:t>
-            </w:r>
-          </w:p>
-        </w:tc>
-        <w:tc>
-          <w:tcPr>
-            <w:tcW w:type="dxa" w:w="6320"/>
-            <w:vAlign w:val="center"/>
-            <w:tcMar>
-              <w:top w:w="110" w:type="dxa"/>
-              <w:start w:w="120" w:type="dxa"/>
-              <w:bottom w:w="110" w:type="dxa"/>
-              <w:end w:w="120" w:type="dxa"/>
-            </w:tcMar>
-          </w:tcPr>
-          <w:p>
-            <w:pPr>
-              <w:spacing w:after="0"/>
-            </w:pPr>
-            <w:r>
-              <w:rPr>
-                <w:rFonts w:ascii="Arial" w:hAnsi="Arial"/>
-                <w:color w:val="17212B"/>
-                <w:sz w:val="17"/>
-              </w:rPr>
-              <w:t>Event discovery, registration fallback, and event CRUD</w:t>
-            </w:r>
-          </w:p>
-        </w:tc>
-      </w:tr>
-      <w:tr>
-        <w:tc>
-          <w:tcPr>
-            <w:tcW w:type="dxa" w:w="2800"/>
-            <w:shd w:fill="F8F1E5"/>
-            <w:vAlign w:val="center"/>
-            <w:tcMar>
-              <w:top w:w="110" w:type="dxa"/>
-              <w:start w:w="120" w:type="dxa"/>
-              <w:bottom w:w="110" w:type="dxa"/>
-              <w:end w:w="120" w:type="dxa"/>
-            </w:tcMar>
-          </w:tcPr>
-          <w:p>
-            <w:pPr>
-              <w:spacing w:after="0"/>
-            </w:pPr>
-            <w:r>
-              <w:rPr>
-                <w:rFonts w:ascii="Consolas" w:hAnsi="Consolas"/>
-                <w:color w:val="BD4F3C"/>
-                <w:sz w:val="16"/>
-              </w:rPr>
-              <w:t>dashboard.php</w:t>
-            </w:r>
-          </w:p>
-        </w:tc>
-        <w:tc>
-          <w:tcPr>
-            <w:tcW w:type="dxa" w:w="6320"/>
-            <w:shd w:fill="F8F1E5"/>
-            <w:vAlign w:val="center"/>
-            <w:tcMar>
-              <w:top w:w="110" w:type="dxa"/>
-              <w:start w:w="120" w:type="dxa"/>
-              <w:bottom w:w="110" w:type="dxa"/>
-              <w:end w:w="120" w:type="dxa"/>
-            </w:tcMar>
-          </w:tcPr>
-          <w:p>
-            <w:pPr>
-              <w:spacing w:after="0"/>
-            </w:pPr>
-            <w:r>
-              <w:rPr>
-                <w:rFonts w:ascii="Arial" w:hAnsi="Arial"/>
-                <w:color w:val="17212B"/>
-                <w:sz w:val="17"/>
-              </w:rPr>
-              <w:t>Student/executive/admin dashboard</w:t>
+              <w:t>Publishing and recipient inbox UI</w:t>
             </w:r>
           </w:p>
         </w:tc>
@@ -10436,6 +10491,38 @@
               </w:rPr>
               <w:t>api/membership.php</w:t>
             </w:r>
+            <w:r>
+              <w:rPr>
+                <w:rFonts w:ascii="Arial" w:hAnsi="Arial"/>
+                <w:color w:val="17212B"/>
+                <w:sz w:val="17"/>
+              </w:rPr>
+              <w:t xml:space="preserve"> / </w:t>
+            </w:r>
+            <w:r>
+              <w:rPr>
+                <w:rFonts w:ascii="Consolas" w:hAnsi="Consolas"/>
+                <w:color w:val="BD4F3C"/>
+                <w:sz w:val="16"/>
+              </w:rPr>
+              <w:t>api/event-registration.php</w:t>
+            </w:r>
+            <w:r>
+              <w:rPr>
+                <w:rFonts w:ascii="Arial" w:hAnsi="Arial"/>
+                <w:color w:val="17212B"/>
+                <w:sz w:val="17"/>
+              </w:rPr>
+              <w:t xml:space="preserve"> / </w:t>
+            </w:r>
+            <w:r>
+              <w:rPr>
+                <w:rFonts w:ascii="Consolas" w:hAnsi="Consolas"/>
+                <w:color w:val="BD4F3C"/>
+                <w:sz w:val="16"/>
+              </w:rPr>
+              <w:t>api/attendance.php</w:t>
+            </w:r>
           </w:p>
         </w:tc>
         <w:tc>
@@ -10459,7 +10546,7 @@
                 <w:color w:val="17212B"/>
                 <w:sz w:val="17"/>
               </w:rPr>
-              <w:t>Membership JSON actions</w:t>
+              <w:t>Membership and transactional participation JSON actions</w:t>
             </w:r>
           </w:p>
         </w:tc>
@@ -10487,7 +10574,23 @@
                 <w:color w:val="BD4F3C"/>
                 <w:sz w:val="16"/>
               </w:rPr>
-              <w:t>api/event-registration.php</w:t>
+              <w:t>api/announcement.php</w:t>
+            </w:r>
+            <w:r>
+              <w:rPr>
+                <w:rFonts w:ascii="Arial" w:hAnsi="Arial"/>
+                <w:color w:val="17212B"/>
+                <w:sz w:val="17"/>
+              </w:rPr>
+              <w:t xml:space="preserve"> / </w:t>
+            </w:r>
+            <w:r>
+              <w:rPr>
+                <w:rFonts w:ascii="Consolas" w:hAnsi="Consolas"/>
+                <w:color w:val="BD4F3C"/>
+                <w:sz w:val="16"/>
+              </w:rPr>
+              <w:t>api/notification.php</w:t>
             </w:r>
           </w:p>
         </w:tc>
@@ -10513,7 +10616,7 @@
                 <w:color w:val="17212B"/>
                 <w:sz w:val="17"/>
               </w:rPr>
-              <w:t>Transactional registration JSON actions</w:t>
+              <w:t>Fan-out and read-state JSON actions</w:t>
             </w:r>
           </w:p>
         </w:tc>
@@ -10761,6 +10864,9 @@
       </w:r>
     </w:p>
     <w:p>
+      <w:pPr>
+        <w:spacing w:after="80"/>
+      </w:pPr>
       <w:r>
         <w:rPr>
           <w:rFonts w:ascii="Arial" w:hAnsi="Arial"/>
@@ -10776,6 +10882,9 @@
       </w:r>
     </w:p>
     <w:p>
+      <w:pPr>
+        <w:spacing w:after="80"/>
+      </w:pPr>
       <w:r>
         <w:rPr>
           <w:rFonts w:ascii="Arial" w:hAnsi="Arial"/>
@@ -10791,6 +10900,9 @@
       </w:r>
     </w:p>
     <w:p>
+      <w:pPr>
+        <w:spacing w:after="80"/>
+      </w:pPr>
       <w:r>
         <w:rPr>
           <w:rFonts w:ascii="Arial" w:hAnsi="Arial"/>
@@ -10818,6 +10930,9 @@
       </w:r>
     </w:p>
     <w:p>
+      <w:pPr>
+        <w:spacing w:after="80"/>
+      </w:pPr>
       <w:r>
         <w:rPr>
           <w:rFonts w:ascii="Arial" w:hAnsi="Arial"/>
@@ -10829,10 +10944,13 @@
         <w:rPr>
           <w:rFonts w:ascii="Arial" w:hAnsi="Arial"/>
         </w:rPr>
-        <w:t xml:space="preserve"> safe event registration and cancellation.</w:t>
-      </w:r>
-    </w:p>
-    <w:p>
+        <w:t xml:space="preserve"> QR registration, attendance check-in, certificate generation, and public verification.</w:t>
+      </w:r>
+    </w:p>
+    <w:p>
+      <w:pPr>
+        <w:spacing w:after="80"/>
+      </w:pPr>
       <w:r>
         <w:rPr>
           <w:rFonts w:ascii="Arial" w:hAnsi="Arial"/>
@@ -10844,10 +10962,13 @@
         <w:rPr>
           <w:rFonts w:ascii="Arial" w:hAnsi="Arial"/>
         </w:rPr>
-        <w:t xml:space="preserve"> register inline, watch capacity change, verify Dashboard, then cancel.</w:t>
-      </w:r>
-    </w:p>
-    <w:p>
+        <w:t xml:space="preserve"> show a QR pass, mark Present, download the PDF, verify its code, then demonstrate revocation.</w:t>
+      </w:r>
+    </w:p>
+    <w:p>
+      <w:pPr>
+        <w:spacing w:after="80"/>
+      </w:pPr>
       <w:r>
         <w:rPr>
           <w:rFonts w:ascii="Arial" w:hAnsi="Arial"/>
@@ -10859,7 +10980,7 @@
         <w:rPr>
           <w:rFonts w:ascii="Arial" w:hAnsi="Arial"/>
         </w:rPr>
-        <w:t xml:space="preserve"> transactional enforcement of uniqueness, deadline, and capacity.</w:t>
+        <w:t xml:space="preserve"> one transactional participation chain from registration to verified certificate.</w:t>
       </w:r>
     </w:p>
     <w:p>
@@ -10875,6 +10996,9 @@
       </w:r>
     </w:p>
     <w:p>
+      <w:pPr>
+        <w:spacing w:after="80"/>
+      </w:pPr>
       <w:r>
         <w:rPr>
           <w:rFonts w:ascii="Arial" w:hAnsi="Arial"/>
@@ -10886,10 +11010,13 @@
         <w:rPr>
           <w:rFonts w:ascii="Arial" w:hAnsi="Arial"/>
         </w:rPr>
-        <w:t xml:space="preserve"> one role-aware dashboard driven by relational aggregates.</w:t>
-      </w:r>
-    </w:p>
-    <w:p>
+        <w:t xml:space="preserve"> announcement publishing, one-time notification fan-out, inbox state, and role-aware dashboards.</w:t>
+      </w:r>
+    </w:p>
+    <w:p>
+      <w:pPr>
+        <w:spacing w:after="80"/>
+      </w:pPr>
       <w:r>
         <w:rPr>
           <w:rFonts w:ascii="Arial" w:hAnsi="Arial"/>
@@ -10901,10 +11028,13 @@
         <w:rPr>
           <w:rFonts w:ascii="Arial" w:hAnsi="Arial"/>
         </w:rPr>
-        <w:t xml:space="preserve"> compare Student, Executive, and Administrator views.</w:t>
-      </w:r>
-    </w:p>
-    <w:p>
+        <w:t xml:space="preserve"> publish once, inspect recipient delivery/read state, then compare Student, Executive, and Administrator views.</w:t>
+      </w:r>
+    </w:p>
+    <w:p>
+      <w:pPr>
+        <w:spacing w:after="80"/>
+      </w:pPr>
       <w:r>
         <w:rPr>
           <w:rFonts w:ascii="Arial" w:hAnsi="Arial"/>
@@ -10916,7 +11046,7 @@
         <w:rPr>
           <w:rFonts w:ascii="Arial" w:hAnsi="Arial"/>
         </w:rPr>
-        <w:t xml:space="preserve"> live derived information without duplicating report data.</w:t>
+        <w:t xml:space="preserve"> audience content becomes recipient-specific engagement without duplicate fan-out.</w:t>
       </w:r>
     </w:p>
     <w:p/>

</xml_diff>